<commit_message>
Paso W-3: Normalizar binarios de Semana 4 (EGAP015 Word/PDF y FGAP040 Word/PDF con roles de planta y YOLOv8)
</commit_message>
<xml_diff>
--- a/curso/semana-04-justificacion-y-epicas/nuestras-entregas/EGAP015_Justificacion_NewBit/EGAP015_Justificacion_NewBit.docx
+++ b/curso/semana-04-justificacion-y-epicas/nuestras-entregas/EGAP015_Justificacion_NewBit/EGAP015_Justificacion_NewBit.docx
@@ -286,19 +286,8 @@
             </w:tcBorders>
           </w:tcPr>
           <w:p>
-            <w:pPr>
-              <w:spacing w:after="60" w:before="60" w:lineRule="auto"/>
-              <w:rPr/>
-            </w:pPr>
             <w:r>
-              <w:rPr>
-                <w:b w:val="0"/>
-                <w:bCs w:val="0"/>
-                <w:sz w:val="20"/>
-                <w:szCs w:val="20"/>
-                <w:rtl w:val="0"/>
-              </w:rPr>
-              <w:t>1.0</w:t>
+              <w:t>2.0</w:t>
             </w:r>
           </w:p>
         </w:tc>
@@ -422,19 +411,8 @@
             </w:tcBorders>
           </w:tcPr>
           <w:p>
-            <w:pPr>
-              <w:spacing w:after="60" w:before="60" w:lineRule="auto"/>
-              <w:rPr/>
-            </w:pPr>
             <w:r>
-              <w:rPr>
-                <w:b w:val="0"/>
-                <w:bCs w:val="0"/>
-                <w:sz w:val="20"/>
-                <w:szCs w:val="20"/>
-                <w:rtl w:val="0"/>
-              </w:rPr>
-              <w:t>12/10/2026</w:t>
+              <w:t>17/10/2026</w:t>
             </w:r>
           </w:p>
         </w:tc>
@@ -448,19 +426,8 @@
             </w:tcBorders>
           </w:tcPr>
           <w:p>
-            <w:pPr>
-              <w:spacing w:after="60" w:before="60" w:lineRule="auto"/>
-              <w:rPr/>
-            </w:pPr>
             <w:r>
-              <w:rPr>
-                <w:b w:val="0"/>
-                <w:bCs w:val="0"/>
-                <w:sz w:val="20"/>
-                <w:szCs w:val="20"/>
-                <w:rtl w:val="0"/>
-              </w:rPr>
-              <w:t xml:space="preserve">Emisión inicial de la justificación</w:t>
+              <w:t>Normalización a manufactura metalmecánica, YOLOv8 y presupuesto consolidado</w:t>
             </w:r>
           </w:p>
         </w:tc>
@@ -556,15 +523,8 @@
             </w:tcBorders>
           </w:tcPr>
           <w:p>
-            <w:pPr>
-              <w:spacing w:after="80" w:lineRule="auto"/>
-              <w:rPr/>
-            </w:pPr>
             <w:r>
-              <w:rPr>
-                <w:rtl w:val="0"/>
-              </w:rPr>
-              <w:t>PY-NB-001 – NewBit: plataforma de Computer Vision que convierte cámaras existentes en sensores inteligentes configurables para operaciones industriales</w:t>
+              <w:t>PY-NB-001 – Sistema web con Visión Artificial para la detección de actos inseguros en áreas operativas de manufactura metalmecánica (Nombre comercial: NewBit)</w:t>
             </w:r>
           </w:p>
         </w:tc>
@@ -636,143 +596,20 @@
             </w:tcBorders>
           </w:tcPr>
           <w:p>
-            <w:pPr>
-              <w:spacing w:after="80" w:lineRule="auto"/>
-              <w:rPr/>
-            </w:pPr>
             <w:r>
-              <w:rPr>
-                <w:b/>
-                <w:bCs/>
-                <w:rtl w:val="0"/>
-              </w:rPr>
-              <w:t xml:space="preserve">Código del proyecto: </w:t>
-            </w:r>
-            <w:r>
-              <w:rPr>
-                <w:rtl w:val="0"/>
-              </w:rPr>
-              <w:t xml:space="preserve">PY-NB-001</w:t>
-            </w:r>
-          </w:p>
-          <w:p>
-            <w:pPr>
-              <w:spacing w:after="80" w:lineRule="auto"/>
-              <w:rPr/>
-            </w:pPr>
-            <w:r>
-              <w:rPr>
-                <w:b/>
-                <w:bCs/>
-                <w:rtl w:val="0"/>
-              </w:rPr>
-              <w:t xml:space="preserve">Nombre del proyecto: </w:t>
-            </w:r>
-            <w:r>
-              <w:rPr>
-                <w:rtl w:val="0"/>
-              </w:rPr>
-              <w:t xml:space="preserve">NewBit: plataforma de Computer Vision que convierte cámaras existentes en sensores inteligentes configurables para operaciones industriales.</w:t>
-            </w:r>
-          </w:p>
-          <w:p>
-            <w:pPr>
-              <w:spacing w:after="80" w:lineRule="auto"/>
-              <w:rPr/>
-            </w:pPr>
-            <w:r>
-              <w:rPr>
-                <w:b/>
-                <w:bCs/>
-                <w:rtl w:val="0"/>
-              </w:rPr>
-              <w:t xml:space="preserve">Organización / área beneficiaria: </w:t>
-            </w:r>
-            <w:r>
-              <w:rPr>
-                <w:rtl w:val="0"/>
-              </w:rPr>
-              <w:t xml:space="preserve">SIDERPERU (caso académico), área de Seguridad y Salud en el Trabajo (SST).</w:t>
-            </w:r>
-          </w:p>
-          <w:p>
-            <w:pPr>
-              <w:spacing w:after="80" w:lineRule="auto"/>
-              <w:rPr/>
-            </w:pPr>
-            <w:r>
-              <w:rPr>
-                <w:b/>
-                <w:bCs/>
-                <w:rtl w:val="0"/>
-              </w:rPr>
-              <w:t xml:space="preserve">Product Owner: </w:t>
-            </w:r>
-            <w:r>
-              <w:rPr>
-                <w:rtl w:val="0"/>
-              </w:rPr>
-              <w:t xml:space="preserve">Albert Sebastian Chumacero Chávarry.</w:t>
-            </w:r>
-          </w:p>
-          <w:p>
-            <w:pPr>
-              <w:spacing w:after="80" w:lineRule="auto"/>
-              <w:rPr/>
-            </w:pPr>
-            <w:r>
-              <w:rPr>
-                <w:b/>
-                <w:bCs/>
-                <w:rtl w:val="0"/>
-              </w:rPr>
-              <w:t xml:space="preserve">Scrum Master: </w:t>
-            </w:r>
-            <w:r>
-              <w:rPr>
-                <w:rtl w:val="0"/>
-              </w:rPr>
-              <w:t xml:space="preserve">Anthony Gabriel Lopez Yrribarren.</w:t>
-            </w:r>
-          </w:p>
-          <w:p>
-            <w:pPr>
-              <w:spacing w:after="80" w:lineRule="auto"/>
-              <w:rPr/>
-            </w:pPr>
-            <w:r>
-              <w:rPr>
-                <w:b/>
-                <w:bCs/>
-                <w:rtl w:val="0"/>
-              </w:rPr>
-              <w:t xml:space="preserve">Developers: </w:t>
-            </w:r>
-            <w:r>
-              <w:rPr>
-                <w:rtl w:val="0"/>
-              </w:rPr>
-              <w:t xml:space="preserve">Anthony Gabriel Lopez Yrribarren y Luis Fernando Salazar Diaz.</w:t>
-            </w:r>
-          </w:p>
-          <w:p>
-            <w:pPr>
-              <w:spacing w:after="80" w:lineRule="auto"/>
-              <w:rPr/>
-            </w:pPr>
-            <w:r>
-              <w:rPr>
-                <w:b/>
-                <w:bCs/>
-                <w:rtl w:val="0"/>
-              </w:rPr>
-              <w:t xml:space="preserve">Metodología: </w:t>
-            </w:r>
-            <w:r>
-              <w:rPr>
-                <w:rtl w:val="0"/>
-              </w:rPr>
-              <w:t xml:space="preserve">Scrum, 4 sprints de dos semanas (05/10/2026 – 18/12/2026).</w:t>
+              <w:t>Código del proyecto: PY-NB-001</w:t>
+              <w:br/>
+              <w:t>Nombre del proyecto: Sistema web con Visión Artificial para la detección de actos inseguros en áreas operativas de manufactura metalmecánica (Nombre comercial: NewBit).</w:t>
+              <w:br/>
+              <w:t>Organización / área beneficiaria: taller de manufactura metalmecánica (caso académico), área de Seguridad y Salud en el Trabajo (SST).</w:t>
+              <w:br/>
+              <w:t>Product Owner: Albert Sebastian Chumacero Chávarry.</w:t>
+              <w:br/>
+              <w:t>Scrum Master: Anthony Gabriel Lopez Yrribarren.</w:t>
+              <w:br/>
+              <w:t>Developers: Anthony Gabriel Lopez Yrribarren y Luis Fernando Salazar Diaz.</w:t>
+              <w:br/>
+              <w:t>Metodología: Scrum, 4 sprints de dos semanas (05/10/2026 – 18/12/2026).</w:t>
             </w:r>
           </w:p>
         </w:tc>
@@ -936,95 +773,16 @@
             </w:tcBorders>
           </w:tcPr>
           <w:p>
-            <w:pPr>
-              <w:spacing w:after="80" w:lineRule="auto"/>
-              <w:rPr/>
-            </w:pPr>
             <w:r>
-              <w:rPr>
-                <w:rtl w:val="0"/>
-              </w:rPr>
-              <w:t xml:space="preserve">La Computer Vision permite aprovechar las cámaras que la planta ya tiene y convertirlas en sensores que interpretan lo que ocurre, sin instalar sensores nuevos.</w:t>
-            </w:r>
-          </w:p>
-          <w:p>
-            <w:pPr>
-              <w:spacing w:after="80" w:lineRule="auto"/>
-              <w:rPr/>
-            </w:pPr>
-            <w:r>
-              <w:rPr>
-                <w:b/>
-                <w:bCs/>
-                <w:rtl w:val="0"/>
-              </w:rPr>
-              <w:t xml:space="preserve">- Detección de objetos (YOLOv4): </w:t>
-            </w:r>
-            <w:r>
-              <w:rPr>
-                <w:rtl w:val="0"/>
-              </w:rPr>
-              <w:t xml:space="preserve">identifica personas y elementos de interés en cada frame y permite descartar los frames sin actividad relevante, lo que reduce el volumen de video que se analiza y el tiempo de procesamiento.</w:t>
-            </w:r>
-          </w:p>
-          <w:p>
-            <w:pPr>
-              <w:spacing w:after="80" w:lineRule="auto"/>
-              <w:rPr/>
-            </w:pPr>
-            <w:r>
-              <w:rPr>
-                <w:b/>
-                <w:bCs/>
-                <w:rtl w:val="0"/>
-              </w:rPr>
-              <w:t xml:space="preserve">- Modelo espacio-temporal (ConvLSTM): </w:t>
-            </w:r>
-            <w:r>
-              <w:rPr>
-                <w:rtl w:val="0"/>
-              </w:rPr>
-              <w:t xml:space="preserve">una conducta no es una foto, es una acción que ocurre en el tiempo. Este modelo analiza la secuencia completa y reconoce la conducta, en lugar de clasificar imágenes aisladas.</w:t>
-            </w:r>
-          </w:p>
-          <w:p>
-            <w:pPr>
-              <w:spacing w:after="80" w:lineRule="auto"/>
-              <w:rPr/>
-            </w:pPr>
-            <w:r>
-              <w:rPr>
-                <w:b/>
-                <w:bCs/>
-                <w:rtl w:val="0"/>
-              </w:rPr>
-              <w:t xml:space="preserve">- Plataforma web con alertas y registro: </w:t>
-            </w:r>
-            <w:r>
-              <w:rPr>
-                <w:rtl w:val="0"/>
-              </w:rPr>
-              <w:t xml:space="preserve">lleva el resultado al usuario como una alerta con evidencia y deja trazabilidad de cada evento.</w:t>
-            </w:r>
-          </w:p>
-          <w:p>
-            <w:pPr>
-              <w:spacing w:after="80" w:lineRule="auto"/>
-              <w:rPr/>
-            </w:pPr>
-            <w:r>
-              <w:rPr>
-                <w:b/>
-                <w:bCs/>
-                <w:rtl w:val="0"/>
-              </w:rPr>
-              <w:t xml:space="preserve">- Herramientas abiertas y datos con licencia: </w:t>
-            </w:r>
-            <w:r>
-              <w:rPr>
-                <w:rtl w:val="0"/>
-              </w:rPr>
-              <w:t xml:space="preserve">Python, PyTorch y Darknet, junto con un dataset público de video industrial (CC BY 4.0), permiten construir la solución sin comprar licencias; el cómputo con GPU se usa bajo demanda.</w:t>
+              <w:t>La Computer Vision permite aprovechar las cámaras que la planta ya tiene y convertirlas en sensores que interpretan lo que ocurre, sin instalar sensores nuevos.</w:t>
+              <w:br/>
+              <w:t>- Detección de objetos (YOLOv8): identifica personas y elementos de interés en cada frame y permite descartar los frames sin actividad relevante, lo que reduce el volumen de video que se analiza y el tiempo de procesamiento.</w:t>
+              <w:br/>
+              <w:t>- Modelo espacio-temporal (ConvLSTM): una conducta no es una foto, es una acción que ocurre en el tiempo. Este modelo analiza la secuencia completa y reconoce la conducta, en lugar de clasificar imágenes aisladas.</w:t>
+              <w:br/>
+              <w:t>- Plataforma web con alertas y registro: lleva el resultado al usuario como una alerta con evidencia y deja trazabilidad de cada evento.</w:t>
+              <w:br/>
+              <w:t>- Herramientas abiertas y datos con licencia: Python, PyTorch y Darknet, junto con un dataset público de video industrial (CC BY 4.0), permiten construir la solución sin comprar licencias; el cómputo con GPU se usa bajo demanda.</w:t>
             </w:r>
           </w:p>
         </w:tc>
@@ -1585,19 +1343,8 @@
             </w:tcBorders>
           </w:tcPr>
           <w:p>
-            <w:pPr>
-              <w:spacing w:after="60" w:before="60" w:lineRule="auto"/>
-              <w:rPr/>
-            </w:pPr>
             <w:r>
-              <w:rPr>
-                <w:b w:val="0"/>
-                <w:bCs w:val="0"/>
-                <w:sz w:val="20"/>
-                <w:szCs w:val="20"/>
-                <w:rtl w:val="0"/>
-              </w:rPr>
-              <w:t xml:space="preserve">Luis Salazar: datos, YOLOv4 y ConvLSTM (200 h × S/ 35)</w:t>
+              <w:t>Luis Salazar: pipeline, visión con OpenCV y YOLOv8 (200 h × S/ 35)</w:t>
             </w:r>
           </w:p>
         </w:tc>
@@ -2009,19 +1756,8 @@
             </w:tcBorders>
           </w:tcPr>
           <w:p>
-            <w:pPr>
-              <w:spacing w:after="60" w:before="60" w:lineRule="auto"/>
-              <w:rPr/>
-            </w:pPr>
             <w:r>
-              <w:rPr>
-                <w:b w:val="0"/>
-                <w:bCs w:val="0"/>
-                <w:sz w:val="20"/>
-                <w:szCs w:val="20"/>
-                <w:rtl w:val="0"/>
-              </w:rPr>
-              <w:t xml:space="preserve">Dataset público CC BY 4.0; Python, PyTorch, Darknet, LabelImg</w:t>
+              <w:t>Dataset público CC BY 4.0 (Kafaoğlu Metal Plastik); Python, FastAPI, OpenCV, Ultralytics YOLOv8</w:t>
             </w:r>
           </w:p>
         </w:tc>
@@ -2529,15 +2265,8 @@
             </w:tcBorders>
           </w:tcPr>
           <w:p>
-            <w:pPr>
-              <w:spacing w:after="80" w:lineRule="auto"/>
-              <w:rPr/>
-            </w:pPr>
             <w:r>
-              <w:rPr>
-                <w:rtl w:val="0"/>
-              </w:rPr>
-              <w:t xml:space="preserve">El proyecto integra las competencias de Ingeniería de Software II en un caso real de la industria regional: gestión ágil con Scrum (roles, eventos y artefactos en 4 sprints); ingeniería de requisitos (épicas, historias de usuario, criterios de aceptación y de terminado); Computer Vision y Deep Learning (YOLOv4 y ConvLSTM); desarrollo web; pruebas unitarias e integradas; gestión de datos y reproducibilidad; y ética y privacidad en sistemas de vigilancia.</w:t>
+              <w:t>El proyecto integra las competencias de Ingeniería de Software II en un caso real de la entorno de manufactura metalmecánica: gestión ágil con Scrum (roles, eventos y artefactos en 4 sprints); ingeniería de requisitos (épicas, historias de usuario, criterios de aceptación y de terminado); Computer Vision y Deep Learning (YOLOv8 y ConvLSTM); desarrollo web; pruebas unitarias e integradas; gestión de datos y reproducibilidad; y ética y privacidad en sistemas de vigilancia.</w:t>
             </w:r>
           </w:p>
         </w:tc>
@@ -2609,135 +2338,26 @@
             </w:tcBorders>
           </w:tcPr>
           <w:p>
-            <w:pPr>
-              <w:spacing w:after="80" w:lineRule="auto"/>
-              <w:rPr/>
-            </w:pPr>
             <w:r>
-              <w:rPr>
-                <w:b/>
-                <w:bCs/>
-                <w:rtl w:val="0"/>
-              </w:rPr>
-              <w:t xml:space="preserve">Beneficios tangibles</w:t>
-            </w:r>
-          </w:p>
-          <w:p>
-            <w:pPr>
-              <w:spacing w:after="80" w:lineRule="auto"/>
-              <w:rPr/>
-            </w:pPr>
-            <w:r>
-              <w:rPr>
-                <w:b/>
-                <w:bCs/>
-                <w:rtl w:val="0"/>
-              </w:rPr>
-              <w:t xml:space="preserve">- Plataforma NewBit con el flujo completo: </w:t>
-            </w:r>
-            <w:r>
-              <w:rPr>
-                <w:rtl w:val="0"/>
-              </w:rPr>
-              <w:t xml:space="preserve">carga de video, detección, reconocimiento de la conducta, alerta y registro.</w:t>
-            </w:r>
-          </w:p>
-          <w:p>
-            <w:pPr>
-              <w:spacing w:after="80" w:lineRule="auto"/>
-              <w:rPr/>
-            </w:pPr>
-            <w:r>
-              <w:rPr>
-                <w:rtl w:val="0"/>
-              </w:rPr>
-              <w:t xml:space="preserve">- Modelos YOLOv4 y ConvLSTM entrenados, evaluados y versionados, con métricas por clase.</w:t>
-            </w:r>
-          </w:p>
-          <w:p>
-            <w:pPr>
-              <w:spacing w:after="80" w:lineRule="auto"/>
-              <w:rPr/>
-            </w:pPr>
-            <w:r>
-              <w:rPr>
-                <w:rtl w:val="0"/>
-              </w:rPr>
-              <w:t xml:space="preserve">- Conjunto de frames anotados para las conductas de la primera versión.</w:t>
-            </w:r>
-          </w:p>
-          <w:p>
-            <w:pPr>
-              <w:spacing w:after="80" w:lineRule="auto"/>
-              <w:rPr/>
-            </w:pPr>
-            <w:r>
-              <w:rPr>
-                <w:rtl w:val="0"/>
-              </w:rPr>
-              <w:t xml:space="preserve">- Historial de eventos y reportes por tipo, zona y semana.</w:t>
-            </w:r>
-          </w:p>
-          <w:p>
-            <w:pPr>
-              <w:spacing w:after="80" w:lineRule="auto"/>
-              <w:rPr/>
-            </w:pPr>
-            <w:r>
-              <w:rPr>
-                <w:rtl w:val="0"/>
-              </w:rPr>
-              <w:t xml:space="preserve">- Documentación de gestión (Acta, Stakeholders, Roles, Épicas, Backlog, Criterios de Terminado) y técnica.</w:t>
-            </w:r>
-          </w:p>
-          <w:p>
-            <w:pPr>
-              <w:spacing w:after="80" w:lineRule="auto"/>
-              <w:rPr/>
-            </w:pPr>
-            <w:r>
-              <w:rPr>
-                <w:b/>
-                <w:bCs/>
-                <w:rtl w:val="0"/>
-              </w:rPr>
-              <w:t xml:space="preserve">Beneficios intangibles</w:t>
-            </w:r>
-          </w:p>
-          <w:p>
-            <w:pPr>
-              <w:spacing w:after="80" w:lineRule="auto"/>
-              <w:rPr/>
-            </w:pPr>
-            <w:r>
-              <w:rPr>
-                <w:rtl w:val="0"/>
-              </w:rPr>
-              <w:t xml:space="preserve">- Experiencia del equipo en desarrollo incremental de soluciones con inteligencia artificial.</w:t>
-            </w:r>
-          </w:p>
-          <w:p>
-            <w:pPr>
-              <w:spacing w:after="80" w:lineRule="auto"/>
-              <w:rPr/>
-            </w:pPr>
-            <w:r>
-              <w:rPr>
-                <w:rtl w:val="0"/>
-              </w:rPr>
-              <w:t xml:space="preserve">- Comprensión de los requisitos de seguridad industrial, privacidad y trazabilidad.</w:t>
-            </w:r>
-          </w:p>
-          <w:p>
-            <w:pPr>
-              <w:spacing w:after="80" w:lineRule="auto"/>
-              <w:rPr/>
-            </w:pPr>
-            <w:r>
-              <w:rPr>
-                <w:rtl w:val="0"/>
-              </w:rPr>
-              <w:t xml:space="preserve">- Fortalecimiento del trabajo colaborativo y de la priorización por valor con Scrum.</w:t>
+              <w:t>Beneficios tangibles</w:t>
+              <w:br/>
+              <w:t>- Plataforma NewBit con el flujo completo: carga de video, detección, reconocimiento de la conducta, alerta y registro.</w:t>
+              <w:br/>
+              <w:t>- Modelos YOLOv8 y ConvLSTM entrenados, evaluados y versionados, con métricas por clase.</w:t>
+              <w:br/>
+              <w:t>- Conjunto de frames anotados para las conductas de la primera versión.</w:t>
+              <w:br/>
+              <w:t>- Historial de eventos y reportes por tipo, zona y semana.</w:t>
+              <w:br/>
+              <w:t>- Documentación de gestión (Acta, Stakeholders, Roles, Épicas, Backlog, Criterios de Terminado) y técnica.</w:t>
+              <w:br/>
+              <w:t>Beneficios intangibles</w:t>
+              <w:br/>
+              <w:t>- Experiencia del equipo en desarrollo incremental de soluciones con inteligencia artificial.</w:t>
+              <w:br/>
+              <w:t>- Comprensión de los requisitos de seguridad industrial, privacidad y trazabilidad.</w:t>
+              <w:br/>
+              <w:t>- Fortalecimiento del trabajo colaborativo y de la priorización por valor con Scrum.</w:t>
             </w:r>
           </w:p>
         </w:tc>
@@ -2809,75 +2429,14 @@
             </w:tcBorders>
           </w:tcPr>
           <w:p>
-            <w:pPr>
-              <w:spacing w:after="80" w:lineRule="auto"/>
-              <w:rPr/>
-            </w:pPr>
             <w:r>
-              <w:rPr>
-                <w:b/>
-                <w:bCs/>
-                <w:rtl w:val="0"/>
-              </w:rPr>
-              <w:t xml:space="preserve">Viabilidad técnica: </w:t>
-            </w:r>
-            <w:r>
-              <w:rPr>
-                <w:rtl w:val="0"/>
-              </w:rPr>
-              <w:t xml:space="preserve">viable, porque existe un dataset público de video industrial con licencia CC BY 4.0, las bibliotecas son abiertas y el entrenamiento puede hacerse con GPU en Colab o local; se requieren 30–50 GB de almacenamiento.</w:t>
-            </w:r>
-          </w:p>
-          <w:p>
-            <w:pPr>
-              <w:spacing w:after="80" w:lineRule="auto"/>
-              <w:rPr/>
-            </w:pPr>
-            <w:r>
-              <w:rPr>
-                <w:b/>
-                <w:bCs/>
-                <w:rtl w:val="0"/>
-              </w:rPr>
-              <w:t xml:space="preserve">Viabilidad operativa: </w:t>
-            </w:r>
-            <w:r>
-              <w:rPr>
-                <w:rtl w:val="0"/>
-              </w:rPr>
-              <w:t xml:space="preserve">viable, con un Product Owner disponible en cada sprint, roles de usuario definidos y una interfaz pensada para usuarios no técnicos.</w:t>
-            </w:r>
-          </w:p>
-          <w:p>
-            <w:pPr>
-              <w:spacing w:after="80" w:lineRule="auto"/>
-              <w:rPr/>
-            </w:pPr>
-            <w:r>
-              <w:rPr>
-                <w:b/>
-                <w:bCs/>
-                <w:rtl w:val="0"/>
-              </w:rPr>
-              <w:t xml:space="preserve">Viabilidad económica: </w:t>
-            </w:r>
-            <w:r>
-              <w:rPr>
-                <w:rtl w:val="0"/>
-              </w:rPr>
-              <w:t xml:space="preserve">viable, con un presupuesto de S/ 20,768, de los cuales S/ 18,600 son dedicación valorizada y el gasto en efectivo es mínimo.</w:t>
-            </w:r>
-          </w:p>
-          <w:p>
-            <w:pPr>
-              <w:spacing w:after="80" w:lineRule="auto"/>
-              <w:rPr/>
-            </w:pPr>
-            <w:r>
-              <w:rPr>
-                <w:rtl w:val="0"/>
-              </w:rPr>
-              <w:t xml:space="preserve">Restricciones principales: la primera versión cubre dos conductas y procesa video grabado (no cámaras en vivo); los datos provienen de una planta y dos cámaras; no incluye instalación en planta ni certificación de SST; el Scrum Master también cumple el rol de Developer.</w:t>
+              <w:t>Viabilidad técnica: viable, porque existe un dataset público de video industrial con licencia CC BY 4.0, las bibliotecas son abiertas y el entrenamiento puede hacerse con GPU en Colab o local; se requieren 30–50 GB de almacenamiento.</w:t>
+              <w:br/>
+              <w:t>Viabilidad operativa: viable, con un Product Owner disponible en cada sprint, roles de usuario definidos y una interfaz pensada para usuarios no técnicos.</w:t>
+              <w:br/>
+              <w:t>Viabilidad económica: viable, con un presupuesto de S/ 20,768, de los cuales S/ 18,600 son dedicación valorizada y el gasto en efectivo es mínimo.</w:t>
+              <w:br/>
+              <w:t>Restricciones principales: la primera versión cubre dos conductas y procesa video grabado (no cámaras en vivo); los datos provienen de una planta y dos cámaras; no incluye instalación en planta ni certificación de SST; el Scrum Master también cumple el rol de Developer.</w:t>
             </w:r>
           </w:p>
         </w:tc>

</xml_diff>